<commit_message>
Deploy preview for PR 15 🛫
</commit_message>
<xml_diff>
--- a/pr-preview/pr-15/vignettes/articles/quarto_article.docx
+++ b/pr-preview/pr-15/vignettes/articles/quarto_article.docx
@@ -23,7 +23,7 @@
         <w:pStyle w:val="Date"/>
       </w:pPr>
       <w:r>
-        <w:t xml:space="preserve">2026-05-05</w:t>
+        <w:t xml:space="preserve">2026-10-27</w:t>
       </w:r>
     </w:p>
     <w:p>
@@ -40,7 +40,7 @@
         <w:rPr>
           <w:rStyle w:val="NormalTok"/>
         </w:rPr>
-        <w:t xml:space="preserve">(rpt)</w:t>
+        <w:t xml:space="preserve">(qnp)</w:t>
       </w:r>
     </w:p>
     <w:bookmarkStart w:id="9" w:name="overview"/>
@@ -2808,7 +2808,7 @@
     </w:p>
     <w:bookmarkEnd w:id="33"/>
     <w:bookmarkEnd w:id="34"/>
-    <w:bookmarkStart w:id="35" w:name="working-with-package-functions"/>
+    <w:bookmarkStart w:id="38" w:name="working-with-package-functions"/>
     <w:p>
       <w:pPr>
         <w:pStyle w:val="Heading2"/>
@@ -2822,7 +2822,22 @@
         <w:pStyle w:val="FirstParagraph"/>
       </w:pPr>
       <w:r>
-        <w:t xml:space="preserve">Here’s how to use the package’s example function with different inputs:</w:t>
+        <w:t xml:space="preserve">Here’s how to use</w:t>
+      </w:r>
+      <w:r>
+        <w:t xml:space="preserve"> </w:t>
+      </w:r>
+      <w:r>
+        <w:rPr>
+          <w:rStyle w:val="VerbatimChar"/>
+        </w:rPr>
+        <w:t xml:space="preserve">interactive_plot()</w:t>
+      </w:r>
+      <w:r>
+        <w:t xml:space="preserve"> </w:t>
+      </w:r>
+      <w:r>
+        <w:t xml:space="preserve">with a different plot:</w:t>
       </w:r>
     </w:p>
     <w:p>
@@ -2831,18 +2846,54 @@
       </w:pPr>
       <w:r>
         <w:rPr>
-          <w:rStyle w:val="CommentTok"/>
-        </w:rPr>
-        <w:t xml:space="preserve"># Numeric vector</w:t>
+          <w:rStyle w:val="NormalTok"/>
+        </w:rPr>
+        <w:t xml:space="preserve">p_line </w:t>
+      </w:r>
+      <w:r>
+        <w:rPr>
+          <w:rStyle w:val="OtherTok"/>
+        </w:rPr>
+        <w:t xml:space="preserve">&lt;-</w:t>
+      </w:r>
+      <w:r>
+        <w:rPr>
+          <w:rStyle w:val="NormalTok"/>
+        </w:rPr>
+        <w:t xml:space="preserve"> ggplot2</w:t>
+      </w:r>
+      <w:r>
+        <w:rPr>
+          <w:rStyle w:val="SpecialCharTok"/>
+        </w:rPr>
+        <w:t xml:space="preserve">::</w:t>
+      </w:r>
+      <w:r>
+        <w:rPr>
+          <w:rStyle w:val="FunctionTok"/>
+        </w:rPr>
+        <w:t xml:space="preserve">ggplot</w:t>
+      </w:r>
+      <w:r>
+        <w:rPr>
+          <w:rStyle w:val="NormalTok"/>
+        </w:rPr>
+        <w:t xml:space="preserve">(</w:t>
       </w:r>
       <w:r>
         <w:br/>
       </w:r>
       <w:r>
         <w:rPr>
+          <w:rStyle w:val="NormalTok"/>
+        </w:rPr>
+        <w:t xml:space="preserve">  </w:t>
+      </w:r>
+      <w:r>
+        <w:rPr>
           <w:rStyle w:val="FunctionTok"/>
         </w:rPr>
-        <w:t xml:space="preserve">example_function</w:t>
+        <w:t xml:space="preserve">data.frame</w:t>
       </w:r>
       <w:r>
         <w:rPr>
@@ -2852,6 +2903,54 @@
       </w:r>
       <w:r>
         <w:rPr>
+          <w:rStyle w:val="AttributeTok"/>
+        </w:rPr>
+        <w:t xml:space="preserve">index =</w:t>
+      </w:r>
+      <w:r>
+        <w:rPr>
+          <w:rStyle w:val="NormalTok"/>
+        </w:rPr>
+        <w:t xml:space="preserve"> </w:t>
+      </w:r>
+      <w:r>
+        <w:rPr>
+          <w:rStyle w:val="DecValTok"/>
+        </w:rPr>
+        <w:t xml:space="preserve">1</w:t>
+      </w:r>
+      <w:r>
+        <w:rPr>
+          <w:rStyle w:val="SpecialCharTok"/>
+        </w:rPr>
+        <w:t xml:space="preserve">:</w:t>
+      </w:r>
+      <w:r>
+        <w:rPr>
+          <w:rStyle w:val="DecValTok"/>
+        </w:rPr>
+        <w:t xml:space="preserve">5</w:t>
+      </w:r>
+      <w:r>
+        <w:rPr>
+          <w:rStyle w:val="NormalTok"/>
+        </w:rPr>
+        <w:t xml:space="preserve">, </w:t>
+      </w:r>
+      <w:r>
+        <w:rPr>
+          <w:rStyle w:val="AttributeTok"/>
+        </w:rPr>
+        <w:t xml:space="preserve">value =</w:t>
+      </w:r>
+      <w:r>
+        <w:rPr>
+          <w:rStyle w:val="NormalTok"/>
+        </w:rPr>
+        <w:t xml:space="preserve"> </w:t>
+      </w:r>
+      <w:r>
+        <w:rPr>
           <w:rStyle w:val="FunctionTok"/>
         </w:rPr>
         <w:t xml:space="preserve">c</w:t>
@@ -2920,43 +3019,130 @@
         <w:rPr>
           <w:rStyle w:val="NormalTok"/>
         </w:rPr>
-        <w:t xml:space="preserve">))</w:t>
+        <w:t xml:space="preserve">)),</w:t>
       </w:r>
       <w:r>
         <w:br/>
       </w:r>
       <w:r>
         <w:rPr>
-          <w:rStyle w:val="CommentTok"/>
-        </w:rPr>
-        <w:t xml:space="preserve">#&gt; [1] 15</w:t>
+          <w:rStyle w:val="NormalTok"/>
+        </w:rPr>
+        <w:t xml:space="preserve">  ggplot2</w:t>
+      </w:r>
+      <w:r>
+        <w:rPr>
+          <w:rStyle w:val="SpecialCharTok"/>
+        </w:rPr>
+        <w:t xml:space="preserve">::</w:t>
+      </w:r>
+      <w:r>
+        <w:rPr>
+          <w:rStyle w:val="FunctionTok"/>
+        </w:rPr>
+        <w:t xml:space="preserve">aes</w:t>
+      </w:r>
+      <w:r>
+        <w:rPr>
+          <w:rStyle w:val="NormalTok"/>
+        </w:rPr>
+        <w:t xml:space="preserve">(index, value)</w:t>
       </w:r>
       <w:r>
         <w:br/>
       </w:r>
       <w:r>
+        <w:rPr>
+          <w:rStyle w:val="NormalTok"/>
+        </w:rPr>
+        <w:t xml:space="preserve">) </w:t>
+      </w:r>
+      <w:r>
+        <w:rPr>
+          <w:rStyle w:val="SpecialCharTok"/>
+        </w:rPr>
+        <w:t xml:space="preserve">+</w:t>
+      </w:r>
+      <w:r>
         <w:br/>
       </w:r>
       <w:r>
         <w:rPr>
-          <w:rStyle w:val="CommentTok"/>
-        </w:rPr>
-        <w:t xml:space="preserve"># Using with generated data</w:t>
+          <w:rStyle w:val="NormalTok"/>
+        </w:rPr>
+        <w:t xml:space="preserve">  ggplot2</w:t>
+      </w:r>
+      <w:r>
+        <w:rPr>
+          <w:rStyle w:val="SpecialCharTok"/>
+        </w:rPr>
+        <w:t xml:space="preserve">::</w:t>
+      </w:r>
+      <w:r>
+        <w:rPr>
+          <w:rStyle w:val="FunctionTok"/>
+        </w:rPr>
+        <w:t xml:space="preserve">geom_line</w:t>
+      </w:r>
+      <w:r>
+        <w:rPr>
+          <w:rStyle w:val="NormalTok"/>
+        </w:rPr>
+        <w:t xml:space="preserve">()</w:t>
       </w:r>
       <w:r>
         <w:br/>
       </w:r>
       <w:r>
-        <w:rPr>
-          <w:rStyle w:val="NormalTok"/>
-        </w:rPr>
-        <w:t xml:space="preserve">random_data </w:t>
-      </w:r>
-      <w:r>
-        <w:rPr>
-          <w:rStyle w:val="OtherTok"/>
-        </w:rPr>
-        <w:t xml:space="preserve">&lt;-</w:t>
+        <w:br/>
+      </w:r>
+      <w:r>
+        <w:rPr>
+          <w:rStyle w:val="FunctionTok"/>
+        </w:rPr>
+        <w:t xml:space="preserve">interactive_plot</w:t>
+      </w:r>
+      <w:r>
+        <w:rPr>
+          <w:rStyle w:val="NormalTok"/>
+        </w:rPr>
+        <w:t xml:space="preserve">(</w:t>
+      </w:r>
+      <w:r>
+        <w:br/>
+      </w:r>
+      <w:r>
+        <w:rPr>
+          <w:rStyle w:val="NormalTok"/>
+        </w:rPr>
+        <w:t xml:space="preserve">  </w:t>
+      </w:r>
+      <w:r>
+        <w:rPr>
+          <w:rStyle w:val="AttributeTok"/>
+        </w:rPr>
+        <w:t xml:space="preserve">plot =</w:t>
+      </w:r>
+      <w:r>
+        <w:rPr>
+          <w:rStyle w:val="NormalTok"/>
+        </w:rPr>
+        <w:t xml:space="preserve"> p_line,</w:t>
+      </w:r>
+      <w:r>
+        <w:br/>
+      </w:r>
+      <w:r>
+        <w:rPr>
+          <w:rStyle w:val="NormalTok"/>
+        </w:rPr>
+        <w:t xml:space="preserve">  </w:t>
+      </w:r>
+      <w:r>
+        <w:rPr>
+          <w:rStyle w:val="AttributeTok"/>
+        </w:rPr>
+        <w:t xml:space="preserve">alt =</w:t>
       </w:r>
       <w:r>
         <w:rPr>
@@ -2966,380 +3152,107 @@
       </w:r>
       <w:r>
         <w:rPr>
-          <w:rStyle w:val="FunctionTok"/>
-        </w:rPr>
-        <w:t xml:space="preserve">runif</w:t>
-      </w:r>
-      <w:r>
-        <w:rPr>
-          <w:rStyle w:val="NormalTok"/>
-        </w:rPr>
-        <w:t xml:space="preserve">(</w:t>
-      </w:r>
-      <w:r>
-        <w:rPr>
-          <w:rStyle w:val="DecValTok"/>
-        </w:rPr>
-        <w:t xml:space="preserve">10</w:t>
-      </w:r>
-      <w:r>
-        <w:rPr>
-          <w:rStyle w:val="NormalTok"/>
-        </w:rPr>
-        <w:t xml:space="preserve">, </w:t>
-      </w:r>
-      <w:r>
-        <w:rPr>
-          <w:rStyle w:val="AttributeTok"/>
-        </w:rPr>
-        <w:t xml:space="preserve">min =</w:t>
-      </w:r>
-      <w:r>
-        <w:rPr>
-          <w:rStyle w:val="NormalTok"/>
-        </w:rPr>
+          <w:rStyle w:val="StringTok"/>
+        </w:rPr>
+        <w:t xml:space="preserve">"Line plot of five increasing values"</w:t>
+      </w:r>
+      <w:r>
+        <w:br/>
+      </w:r>
+      <w:r>
+        <w:rPr>
+          <w:rStyle w:val="NormalTok"/>
+        </w:rPr>
+        <w:t xml:space="preserve">)</w:t>
+      </w:r>
+    </w:p>
+    <w:p>
+      <w:pPr>
+        <w:pStyle w:val="FirstParagraph"/>
+      </w:pPr>
+      <w:r>
+        <w:drawing>
+          <wp:inline>
+            <wp:extent cx="5334000" cy="3809999"/>
+            <wp:effectExtent b="0" l="0" r="0" t="0"/>
+            <wp:docPr descr="" title="" id="36" name="Picture"/>
+            <a:graphic>
+              <a:graphicData uri="http://schemas.openxmlformats.org/drawingml/2006/picture">
+                <pic:pic>
+                  <pic:nvPicPr>
+                    <pic:cNvPr descr="quarto_article_files/figure-docx/unnamed-chunk-7-1.png" id="37" name="Picture"/>
+                    <pic:cNvPicPr>
+                      <a:picLocks noChangeArrowheads="1" noChangeAspect="1"/>
+                    </pic:cNvPicPr>
+                  </pic:nvPicPr>
+                  <pic:blipFill>
+                    <a:blip r:embed="rId35"/>
+                    <a:stretch>
+                      <a:fillRect/>
+                    </a:stretch>
+                  </pic:blipFill>
+                  <pic:spPr bwMode="auto">
+                    <a:xfrm>
+                      <a:off x="0" y="0"/>
+                      <a:ext cx="5334000" cy="3809999"/>
+                    </a:xfrm>
+                    <a:prstGeom prst="rect">
+                      <a:avLst/>
+                    </a:prstGeom>
+                    <a:noFill/>
+                    <a:ln w="9525">
+                      <a:noFill/>
+                      <a:headEnd/>
+                      <a:tailEnd/>
+                    </a:ln>
+                  </pic:spPr>
+                </pic:pic>
+              </a:graphicData>
+            </a:graphic>
+          </wp:inline>
+        </w:drawing>
+      </w:r>
+    </w:p>
+    <w:bookmarkEnd w:id="38"/>
+    <w:bookmarkStart w:id="48" w:name="theorem-environments"/>
+    <w:p>
+      <w:pPr>
+        <w:pStyle w:val="Heading2"/>
+      </w:pPr>
+      <w:r>
+        <w:t xml:space="preserve">5 Theorem Environments</w:t>
+      </w:r>
+    </w:p>
+    <w:p>
+      <w:pPr>
+        <w:pStyle w:val="FirstParagraph"/>
+      </w:pPr>
+      <w:r>
+        <w:t xml:space="preserve">The</w:t>
+      </w:r>
+      <w:r>
         <w:t xml:space="preserve"> </w:t>
       </w:r>
       <w:r>
         <w:rPr>
-          <w:rStyle w:val="DecValTok"/>
-        </w:rPr>
-        <w:t xml:space="preserve">0</w:t>
-      </w:r>
-      <w:r>
-        <w:rPr>
-          <w:rStyle w:val="NormalTok"/>
-        </w:rPr>
-        <w:t xml:space="preserve">, </w:t>
-      </w:r>
-      <w:r>
-        <w:rPr>
-          <w:rStyle w:val="AttributeTok"/>
-        </w:rPr>
-        <w:t xml:space="preserve">max =</w:t>
-      </w:r>
-      <w:r>
-        <w:rPr>
-          <w:rStyle w:val="NormalTok"/>
-        </w:rPr>
+          <w:rStyle w:val="VerbatimChar"/>
+        </w:rPr>
+        <w:t xml:space="preserve">callouty-theorem</w:t>
+      </w:r>
+      <w:r>
         <w:t xml:space="preserve"> </w:t>
       </w:r>
       <w:r>
-        <w:rPr>
-          <w:rStyle w:val="DecValTok"/>
-        </w:rPr>
-        <w:t xml:space="preserve">100</w:t>
-      </w:r>
-      <w:r>
-        <w:rPr>
-          <w:rStyle w:val="NormalTok"/>
-        </w:rPr>
-        <w:t xml:space="preserve">)</w:t>
-      </w:r>
-      <w:r>
-        <w:br/>
-      </w:r>
-      <w:r>
-        <w:rPr>
-          <w:rStyle w:val="FunctionTok"/>
-        </w:rPr>
-        <w:t xml:space="preserve">example_function</w:t>
-      </w:r>
-      <w:r>
-        <w:rPr>
-          <w:rStyle w:val="NormalTok"/>
-        </w:rPr>
-        <w:t xml:space="preserve">(random_data)</w:t>
-      </w:r>
-      <w:r>
-        <w:br/>
-      </w:r>
-      <w:r>
-        <w:rPr>
-          <w:rStyle w:val="CommentTok"/>
-        </w:rPr>
-        <w:t xml:space="preserve">#&gt; [1] 47.43</w:t>
-      </w:r>
-    </w:p>
-    <w:bookmarkEnd w:id="35"/>
-    <w:bookmarkStart w:id="37" w:name="code-annotations"/>
-    <w:p>
-      <w:pPr>
-        <w:pStyle w:val="Heading2"/>
-      </w:pPr>
-      <w:r>
-        <w:t xml:space="preserve">5 Code Annotations</w:t>
-      </w:r>
-    </w:p>
-    <w:p>
-      <w:pPr>
-        <w:pStyle w:val="FirstParagraph"/>
-      </w:pPr>
-      <w:r>
-        <w:t xml:space="preserve">Quarto supports code annotations for detailed explanations:</w:t>
-      </w:r>
-    </w:p>
-    <w:bookmarkStart w:id="36" w:name="annotated-cell-6"/>
-    <w:p>
-      <w:pPr>
-        <w:pStyle w:val="SourceCode"/>
-      </w:pPr>
-      <w:r>
-        <w:br/>
-      </w:r>
-      <w:r>
-        <w:rPr>
-          <w:rStyle w:val="NormalTok"/>
-        </w:rPr>
-        <w:t xml:space="preserve">data </w:t>
-      </w:r>
-      <w:r>
-        <w:rPr>
-          <w:rStyle w:val="OtherTok"/>
-        </w:rPr>
-        <w:t xml:space="preserve">&lt;-</w:t>
-      </w:r>
-      <w:r>
-        <w:rPr>
-          <w:rStyle w:val="NormalTok"/>
-        </w:rPr>
-        <w:t xml:space="preserve"> </w:t>
-      </w:r>
-      <w:r>
-        <w:rPr>
-          <w:rStyle w:val="FunctionTok"/>
-        </w:rPr>
-        <w:t xml:space="preserve">c</w:t>
-      </w:r>
-      <w:r>
-        <w:rPr>
-          <w:rStyle w:val="NormalTok"/>
-        </w:rPr>
-        <w:t xml:space="preserve">(</w:t>
-      </w:r>
-      <w:r>
-        <w:rPr>
-          <w:rStyle w:val="DecValTok"/>
-        </w:rPr>
-        <w:t xml:space="preserve">1</w:t>
-      </w:r>
-      <w:r>
-        <w:rPr>
-          <w:rStyle w:val="NormalTok"/>
-        </w:rPr>
-        <w:t xml:space="preserve">, </w:t>
-      </w:r>
-      <w:r>
-        <w:rPr>
-          <w:rStyle w:val="DecValTok"/>
-        </w:rPr>
-        <w:t xml:space="preserve">2</w:t>
-      </w:r>
-      <w:r>
-        <w:rPr>
-          <w:rStyle w:val="NormalTok"/>
-        </w:rPr>
-        <w:t xml:space="preserve">, </w:t>
-      </w:r>
-      <w:r>
-        <w:rPr>
-          <w:rStyle w:val="DecValTok"/>
-        </w:rPr>
-        <w:t xml:space="preserve">3</w:t>
-      </w:r>
-      <w:r>
-        <w:rPr>
-          <w:rStyle w:val="NormalTok"/>
-        </w:rPr>
-        <w:t xml:space="preserve">, </w:t>
-      </w:r>
-      <w:r>
-        <w:rPr>
-          <w:rStyle w:val="DecValTok"/>
-        </w:rPr>
-        <w:t xml:space="preserve">4</w:t>
-      </w:r>
-      <w:r>
-        <w:rPr>
-          <w:rStyle w:val="NormalTok"/>
-        </w:rPr>
-        <w:t xml:space="preserve">, </w:t>
-      </w:r>
-      <w:r>
-        <w:rPr>
-          <w:rStyle w:val="DecValTok"/>
-        </w:rPr>
-        <w:t xml:space="preserve">5</w:t>
-      </w:r>
-      <w:r>
-        <w:rPr>
-          <w:rStyle w:val="NormalTok"/>
-        </w:rPr>
-        <w:t xml:space="preserve">)</w:t>
-      </w:r>
-      <w:r>
-        <w:br/>
-      </w:r>
-      <w:r>
-        <w:rPr>
-          <w:rStyle w:val="NormalTok"/>
-        </w:rPr>
-        <w:t xml:space="preserve">result </w:t>
-      </w:r>
-      <w:r>
-        <w:rPr>
-          <w:rStyle w:val="OtherTok"/>
-        </w:rPr>
-        <w:t xml:space="preserve">&lt;-</w:t>
-      </w:r>
-      <w:r>
-        <w:rPr>
-          <w:rStyle w:val="NormalTok"/>
-        </w:rPr>
-        <w:t xml:space="preserve"> </w:t>
-      </w:r>
-      <w:r>
-        <w:rPr>
-          <w:rStyle w:val="FunctionTok"/>
-        </w:rPr>
-        <w:t xml:space="preserve">example_function</w:t>
-      </w:r>
-      <w:r>
-        <w:rPr>
-          <w:rStyle w:val="NormalTok"/>
-        </w:rPr>
-        <w:t xml:space="preserve">(data)</w:t>
-      </w:r>
-      <w:r>
-        <w:br/>
-      </w:r>
-      <w:r>
-        <w:rPr>
-          <w:rStyle w:val="FunctionTok"/>
-        </w:rPr>
-        <w:t xml:space="preserve">print</w:t>
-      </w:r>
-      <w:r>
-        <w:rPr>
-          <w:rStyle w:val="NormalTok"/>
-        </w:rPr>
-        <w:t xml:space="preserve">(result)</w:t>
-      </w:r>
-      <w:r>
-        <w:br/>
-      </w:r>
-      <w:r>
-        <w:rPr>
-          <w:rStyle w:val="CommentTok"/>
-        </w:rPr>
-        <w:t xml:space="preserve">#&gt; [1] 3</w:t>
-      </w:r>
-    </w:p>
-    <w:bookmarkEnd w:id="36"/>
-    <w:p>
-      <w:pPr>
-        <w:pStyle w:val="DefinitionTerm"/>
-      </w:pPr>
-      <w:r>
-        <w:t xml:space="preserve">Line 1</w:t>
-      </w:r>
-    </w:p>
-    <w:p>
-      <w:pPr>
-        <w:pStyle w:val="Definition"/>
-      </w:pPr>
-      <w:r>
-        <w:t xml:space="preserve">Load sample data</w:t>
-      </w:r>
-    </w:p>
-    <w:p>
-      <w:pPr>
-        <w:pStyle w:val="DefinitionTerm"/>
-      </w:pPr>
-      <w:r>
-        <w:t xml:space="preserve">Line 2</w:t>
-      </w:r>
-    </w:p>
-    <w:p>
-      <w:pPr>
-        <w:pStyle w:val="Definition"/>
-      </w:pPr>
-      <w:r>
-        <w:t xml:space="preserve">Create a simple numeric vector</w:t>
-      </w:r>
-    </w:p>
-    <w:p>
-      <w:pPr>
-        <w:pStyle w:val="DefinitionTerm"/>
-      </w:pPr>
-      <w:r>
-        <w:t xml:space="preserve">Line 3</w:t>
-      </w:r>
-    </w:p>
-    <w:p>
-      <w:pPr>
-        <w:pStyle w:val="Definition"/>
-      </w:pPr>
-      <w:r>
-        <w:t xml:space="preserve">Apply the example function from the package</w:t>
-      </w:r>
-    </w:p>
-    <w:p>
-      <w:pPr>
-        <w:pStyle w:val="DefinitionTerm"/>
-      </w:pPr>
-      <w:r>
-        <w:t xml:space="preserve">Line 4</w:t>
-      </w:r>
-    </w:p>
-    <w:p>
-      <w:pPr>
-        <w:pStyle w:val="Definition"/>
-      </w:pPr>
-      <w:r>
-        <w:t xml:space="preserve">Display the results</w:t>
-      </w:r>
-    </w:p>
-    <w:bookmarkEnd w:id="37"/>
-    <w:bookmarkStart w:id="50" w:name="theorem-environments"/>
-    <w:p>
-      <w:pPr>
-        <w:pStyle w:val="Heading2"/>
-      </w:pPr>
-      <w:r>
-        <w:t xml:space="preserve">6 Theorem Environments</w:t>
-      </w:r>
-    </w:p>
-    <w:p>
-      <w:pPr>
-        <w:pStyle w:val="FirstParagraph"/>
-      </w:pPr>
-      <w:r>
-        <w:t xml:space="preserve">The</w:t>
-      </w:r>
-      <w:r>
-        <w:t xml:space="preserve"> </w:t>
-      </w:r>
-      <w:r>
-        <w:rPr>
-          <w:rStyle w:val="VerbatimChar"/>
-        </w:rPr>
-        <w:t xml:space="preserve">callouty-theorem</w:t>
-      </w:r>
-      <w:r>
-        <w:t xml:space="preserve"> </w:t>
-      </w:r>
-      <w:r>
         <w:t xml:space="preserve">extension renders Quarto theorem and proof environments as styled callout blocks. This makes theorems, definitions, examples, and proofs visually distinct and easier to navigate.</w:t>
       </w:r>
     </w:p>
-    <w:bookmarkStart w:id="43" w:name="definitions-and-theorems"/>
+    <w:bookmarkStart w:id="41" w:name="definitions-and-theorems"/>
     <w:p>
       <w:pPr>
         <w:pStyle w:val="Heading3"/>
       </w:pPr>
       <w:r>
-        <w:t xml:space="preserve">6.1 Definitions and Theorems</w:t>
+        <w:t xml:space="preserve">5.1 Definitions and Theorems</w:t>
       </w:r>
     </w:p>
     <w:tbl>
@@ -3347,7 +3260,7 @@
         <w:tblStyle w:val="Table"/>
         <w:tblInd w:w="164" w:type="dxa"/>
         <w:tblBorders>
-          <w:left w:val="single" w:sz="24" w:space="0" w:color="00A047"/>
+          <w:left w:val="single" w:sz="24" w:space="0" w:color="909090"/>
         </w:tblBorders>
         <w:tblCellMar>
           <w:left w:w="0" w:type="dxa"/>
@@ -3375,8 +3288,15 @@
             <w:pPr>
               <w:spacing w:before="16" w:after="64"/>
             </w:pPr>
+            <w:r>
+              <w:rPr>
+                <w:b/>
+                <w:bCs/>
+              </w:rPr>
+              <w:t xml:space="preserve">Definition (Standard Error)</w:t>
+            </w:r>
           </w:p>
-          <w:bookmarkStart w:id="38" w:name="def-se"/>
+          <w:bookmarkStart w:id="39" w:name="def-se"/>
           <w:p>
             <w:pPr>
               <w:pStyle w:val="BodyText"/>
@@ -3486,7 +3406,7 @@
               </m:oMath>
             </m:oMathPara>
           </w:p>
-          <w:bookmarkEnd w:id="38"/>
+          <w:bookmarkEnd w:id="39"/>
         </w:tc>
       </w:tr>
     </w:tbl>
@@ -3503,7 +3423,7 @@
         <w:tblStyle w:val="Table"/>
         <w:tblInd w:w="164" w:type="dxa"/>
         <w:tblBorders>
-          <w:left w:val="single" w:sz="24" w:space="0" w:color="0758E5"/>
+          <w:left w:val="single" w:sz="24" w:space="0" w:color="909090"/>
         </w:tblBorders>
         <w:tblCellMar>
           <w:left w:w="0" w:type="dxa"/>
@@ -3531,8 +3451,15 @@
             <w:pPr>
               <w:spacing w:before="16" w:after="64"/>
             </w:pPr>
+            <w:r>
+              <w:rPr>
+                <w:b/>
+                <w:bCs/>
+              </w:rPr>
+              <w:t xml:space="preserve">Theorem (Central Limit Theorem)</w:t>
+            </w:r>
           </w:p>
-          <w:bookmarkStart w:id="39" w:name="thm-clt"/>
+          <w:bookmarkStart w:id="40" w:name="thm-clt"/>
           <w:p>
             <w:pPr>
               <w:pStyle w:val="BodyText"/>
@@ -3781,7 +3708,7 @@
               </m:oMath>
             </m:oMathPara>
           </w:p>
-          <w:bookmarkEnd w:id="39"/>
+          <w:bookmarkEnd w:id="40"/>
         </w:tc>
       </w:tr>
     </w:tbl>
@@ -3798,10 +3725,10 @@
         <w:tblStyle w:val="Table"/>
         <w:tblLook w:firstRow="0" w:lastRow="0" w:firstColumn="0" w:lastColumn="0" w:noHBand="0" w:noVBand="0" w:val="0000"/>
         <w:tblBorders>
-          <w:top w:val="single" w:sz="4" w:space="0" w:color="0758E5"/>
-          <w:left w:val="single" w:sz="24" w:space="0" w:color="0758E5"/>
-          <w:bottom w:val="single" w:sz="4" w:space="0" w:color="0758E5"/>
-          <w:right w:val="single" w:sz="4" w:space="0" w:color="0758E5"/>
+          <w:top w:val="single" w:sz="4" w:space="0" w:color="909090"/>
+          <w:left w:val="single" w:sz="24" w:space="0" w:color="909090"/>
+          <w:bottom w:val="single" w:sz="4" w:space="0" w:color="909090"/>
+          <w:right w:val="single" w:sz="4" w:space="0" w:color="909090"/>
         </w:tblBorders>
         <w:tblCellMar>
           <w:left w:w="144" w:type="dxa"/>
@@ -3815,7 +3742,7 @@
         </w:trPr>
         <w:tc>
           <w:tcPr>
-            <w:shd w:color="auto" w:fill="dae6fb" w:val="clear"/>
+            <w:shd w:color="auto" w:fill="e6e6e6" w:val="clear"/>
             <w:tcMar>
               <w:top w:w="92" w:type="dxa"/>
               <w:bottom w:w="92" w:type="dxa"/>
@@ -3826,57 +3753,8 @@
               <w:pStyle w:val="BodyText"/>
             </w:pPr>
             <w:pPr>
-              <w:spacing w:before="0" w:after="0"/>
-              <w:textAlignment w:val="center"/>
+              <w:spacing w:before="16" w:after="16"/>
             </w:pPr>
-            <w:r>
-              <w:drawing>
-                <wp:inline>
-                  <wp:extent cx="152400" cy="152400"/>
-                  <wp:effectExtent b="0" l="0" r="0" t="0"/>
-                  <wp:docPr descr="" title="" id="41" name="Picture"/>
-                  <a:graphic>
-                    <a:graphicData uri="http://schemas.openxmlformats.org/drawingml/2006/picture">
-                      <pic:pic>
-                        <pic:nvPicPr>
-                          <pic:cNvPr descr="/opt/quarto/share/formats/docx/note.png" id="42" name="Picture"/>
-                          <pic:cNvPicPr>
-                            <a:picLocks noChangeArrowheads="1" noChangeAspect="1"/>
-                          </pic:cNvPicPr>
-                        </pic:nvPicPr>
-                        <pic:blipFill>
-                          <a:blip r:embed="rId40"/>
-                          <a:stretch>
-                            <a:fillRect/>
-                          </a:stretch>
-                        </pic:blipFill>
-                        <pic:spPr bwMode="auto">
-                          <a:xfrm>
-                            <a:off x="0" y="0"/>
-                            <a:ext cx="152400" cy="152400"/>
-                          </a:xfrm>
-                          <a:prstGeom prst="rect">
-                            <a:avLst/>
-                          </a:prstGeom>
-                          <a:noFill/>
-                          <a:ln w="9525">
-                            <a:noFill/>
-                            <a:headEnd/>
-                            <a:tailEnd/>
-                          </a:ln>
-                        </pic:spPr>
-                      </pic:pic>
-                    </a:graphicData>
-                  </a:graphic>
-                </wp:inline>
-              </w:drawing>
-            </w:r>
-            <w:r>
-              <w:t xml:space="preserve"> </w:t>
-            </w:r>
-            <w:r>
-              <w:t xml:space="preserve"> </w:t>
-            </w:r>
             <w:r>
               <w:t xml:space="preserve">Proof</w:t>
             </w:r>
@@ -3916,14 +3794,14 @@
         </w:tc>
       </w:tr>
     </w:tbl>
-    <w:bookmarkEnd w:id="43"/>
-    <w:bookmarkStart w:id="46" w:name="lemmas-and-corollaries"/>
+    <w:bookmarkEnd w:id="41"/>
+    <w:bookmarkStart w:id="44" w:name="lemmas-and-corollaries"/>
     <w:p>
       <w:pPr>
         <w:pStyle w:val="Heading3"/>
       </w:pPr>
       <w:r>
-        <w:t xml:space="preserve">6.2 Lemmas and Corollaries</w:t>
+        <w:t xml:space="preserve">5.2 Lemmas and Corollaries</w:t>
       </w:r>
     </w:p>
     <w:tbl>
@@ -3931,7 +3809,7 @@
         <w:tblStyle w:val="Table"/>
         <w:tblInd w:w="164" w:type="dxa"/>
         <w:tblBorders>
-          <w:left w:val="single" w:sz="24" w:space="0" w:color="0758E5"/>
+          <w:left w:val="single" w:sz="24" w:space="0" w:color="909090"/>
         </w:tblBorders>
         <w:tblCellMar>
           <w:left w:w="0" w:type="dxa"/>
@@ -3959,8 +3837,15 @@
             <w:pPr>
               <w:spacing w:before="16" w:after="64"/>
             </w:pPr>
+            <w:r>
+              <w:rPr>
+                <w:b/>
+                <w:bCs/>
+              </w:rPr>
+              <w:t xml:space="preserve">Lemma (Variance of a Sum)</w:t>
+            </w:r>
           </w:p>
-          <w:bookmarkStart w:id="44" w:name="lem-var-sum"/>
+          <w:bookmarkStart w:id="42" w:name="lem-var-sum"/>
           <w:p>
             <w:pPr>
               <w:pStyle w:val="BodyText"/>
@@ -4103,7 +3988,7 @@
               </m:oMath>
             </m:oMathPara>
           </w:p>
-          <w:bookmarkEnd w:id="44"/>
+          <w:bookmarkEnd w:id="42"/>
         </w:tc>
       </w:tr>
     </w:tbl>
@@ -4120,7 +4005,7 @@
         <w:tblStyle w:val="Table"/>
         <w:tblInd w:w="164" w:type="dxa"/>
         <w:tblBorders>
-          <w:left w:val="single" w:sz="24" w:space="0" w:color="0758E5"/>
+          <w:left w:val="single" w:sz="24" w:space="0" w:color="909090"/>
         </w:tblBorders>
         <w:tblCellMar>
           <w:left w:w="0" w:type="dxa"/>
@@ -4148,8 +4033,15 @@
             <w:pPr>
               <w:spacing w:before="16" w:after="64"/>
             </w:pPr>
+            <w:r>
+              <w:rPr>
+                <w:b/>
+                <w:bCs/>
+              </w:rPr>
+              <w:t xml:space="preserve">Corollary (Confidence Interval from CLT)</w:t>
+            </w:r>
           </w:p>
-          <w:bookmarkStart w:id="45" w:name="cor-se-clt"/>
+          <w:bookmarkStart w:id="43" w:name="cor-se-clt"/>
           <w:p>
             <w:pPr>
               <w:pStyle w:val="BodyText"/>
@@ -4256,36 +4148,61 @@
               </m:oMath>
             </m:oMathPara>
           </w:p>
-          <w:bookmarkEnd w:id="45"/>
+          <w:bookmarkEnd w:id="43"/>
         </w:tc>
       </w:tr>
     </w:tbl>
-    <w:bookmarkEnd w:id="46"/>
-    <w:bookmarkStart w:id="49" w:name="examples-and-exercises"/>
+    <w:bookmarkEnd w:id="44"/>
+    <w:bookmarkStart w:id="47" w:name="examples-and-exercises"/>
     <w:p>
       <w:pPr>
         <w:pStyle w:val="Heading3"/>
       </w:pPr>
       <w:r>
-        <w:t xml:space="preserve">6.3 Examples and Exercises</w:t>
+        <w:t xml:space="preserve">5.3 Examples and Exercises</w:t>
       </w:r>
     </w:p>
     <w:tbl>
       <w:tblPr>
         <w:tblStyle w:val="Table"/>
-        <w:tblInd w:w="164" w:type="dxa"/>
+        <w:tblLook w:firstRow="0" w:lastRow="0" w:firstColumn="0" w:lastColumn="0" w:noHBand="0" w:noVBand="0" w:val="0000"/>
         <w:tblBorders>
-          <w:left w:val="single" w:sz="24" w:space="0" w:color="00A047"/>
+          <w:top w:val="single" w:sz="4" w:space="0" w:color="909090"/>
+          <w:left w:val="single" w:sz="24" w:space="0" w:color="909090"/>
+          <w:bottom w:val="single" w:sz="4" w:space="0" w:color="909090"/>
+          <w:right w:val="single" w:sz="4" w:space="0" w:color="909090"/>
         </w:tblBorders>
         <w:tblCellMar>
-          <w:left w:w="0" w:type="dxa"/>
-          <w:right w:w="0" w:type="dxa"/>
+          <w:left w:w="144" w:type="dxa"/>
+          <w:right w:w="144" w:type="dxa"/>
         </w:tblCellMar>
         <w:tblLook w:firstRow="0" w:lastRow="0" w:firstColumn="0" w:lastColumn="0" w:noHBand="0" w:noVBand="0" w:val="0000"/>
       </w:tblPr>
-      <w:tblGrid>
-        <w:gridCol w:w="7920"/>
-      </w:tblGrid>
+      <w:tr>
+        <w:trPr>
+          <w:cantSplit/>
+        </w:trPr>
+        <w:tc>
+          <w:tcPr>
+            <w:shd w:color="auto" w:fill="e6e6e6" w:val="clear"/>
+            <w:tcMar>
+              <w:top w:w="92" w:type="dxa"/>
+              <w:bottom w:w="92" w:type="dxa"/>
+            </w:tcMar>
+          </w:tcPr>
+          <w:p>
+            <w:pPr>
+              <w:pStyle w:val="FirstParagraph"/>
+            </w:pPr>
+            <w:pPr>
+              <w:spacing w:before="16" w:after="16"/>
+            </w:pPr>
+            <w:r>
+              <w:t xml:space="preserve">Example (95% Confidence Interval)</w:t>
+            </w:r>
+          </w:p>
+        </w:tc>
+      </w:tr>
       <w:tr>
         <w:trPr>
           <w:cantSplit/>
@@ -4293,18 +4210,11 @@
         <w:tc>
           <w:tcPr>
             <w:tcMar>
-              <w:left w:w="144" w:type="dxa"/>
+              <w:top w:w="108" w:type="dxa"/>
+              <w:bottom w:w="108" w:type="dxa"/>
             </w:tcMar>
           </w:tcPr>
-          <w:p>
-            <w:pPr>
-              <w:pStyle w:val="FirstParagraph"/>
-            </w:pPr>
-            <w:pPr>
-              <w:spacing w:before="16" w:after="64"/>
-            </w:pPr>
-          </w:p>
-          <w:bookmarkStart w:id="47" w:name="exm-ci"/>
+          <w:bookmarkStart w:id="45" w:name="exm-ci"/>
           <w:p>
             <w:pPr>
               <w:pStyle w:val="BodyText"/>
@@ -4754,7 +4664,8 @@
               <w:t xml:space="preserve">#&gt; Mean = 4.929, 95% CI: [4.290, 5.567]</w:t>
             </w:r>
           </w:p>
-          <w:bookmarkEnd w:id="47"/>
+          <w:bookmarkEnd w:id="45"/>
+          <w:p/>
         </w:tc>
       </w:tr>
     </w:tbl>
@@ -4771,7 +4682,7 @@
         <w:tblStyle w:val="Table"/>
         <w:tblInd w:w="164" w:type="dxa"/>
         <w:tblBorders>
-          <w:left w:val="single" w:sz="24" w:space="0" w:color="00A047"/>
+          <w:left w:val="single" w:sz="24" w:space="0" w:color="909090"/>
         </w:tblBorders>
         <w:tblCellMar>
           <w:left w:w="0" w:type="dxa"/>
@@ -4799,8 +4710,15 @@
             <w:pPr>
               <w:spacing w:before="16" w:after="64"/>
             </w:pPr>
+            <w:r>
+              <w:rPr>
+                <w:b/>
+                <w:bCs/>
+              </w:rPr>
+              <w:t xml:space="preserve">Exercise (Exercise: Computing Standard Error)</w:t>
+            </w:r>
           </w:p>
-          <w:bookmarkStart w:id="48" w:name="exr-se"/>
+          <w:bookmarkStart w:id="46" w:name="exr-se"/>
           <w:p>
             <w:pPr>
               <w:pStyle w:val="BodyText"/>
@@ -4862,7 +4780,7 @@
               <w:t xml:space="preserve">.</w:t>
             </w:r>
           </w:p>
-          <w:bookmarkEnd w:id="48"/>
+          <w:bookmarkEnd w:id="46"/>
         </w:tc>
       </w:tr>
     </w:tbl>
@@ -4879,10 +4797,10 @@
         <w:tblStyle w:val="Table"/>
         <w:tblLook w:firstRow="0" w:lastRow="0" w:firstColumn="0" w:lastColumn="0" w:noHBand="0" w:noVBand="0" w:val="0000"/>
         <w:tblBorders>
-          <w:top w:val="single" w:sz="4" w:space="0" w:color="0758E5"/>
-          <w:left w:val="single" w:sz="24" w:space="0" w:color="0758E5"/>
-          <w:bottom w:val="single" w:sz="4" w:space="0" w:color="0758E5"/>
-          <w:right w:val="single" w:sz="4" w:space="0" w:color="0758E5"/>
+          <w:top w:val="single" w:sz="4" w:space="0" w:color="909090"/>
+          <w:left w:val="single" w:sz="24" w:space="0" w:color="909090"/>
+          <w:bottom w:val="single" w:sz="4" w:space="0" w:color="909090"/>
+          <w:right w:val="single" w:sz="4" w:space="0" w:color="909090"/>
         </w:tblBorders>
         <w:tblCellMar>
           <w:left w:w="144" w:type="dxa"/>
@@ -4896,7 +4814,7 @@
         </w:trPr>
         <w:tc>
           <w:tcPr>
-            <w:shd w:color="auto" w:fill="dae6fb" w:val="clear"/>
+            <w:shd w:color="auto" w:fill="e6e6e6" w:val="clear"/>
             <w:tcMar>
               <w:top w:w="92" w:type="dxa"/>
               <w:bottom w:w="92" w:type="dxa"/>
@@ -5022,15 +4940,15 @@
         </w:tc>
       </w:tr>
     </w:tbl>
-    <w:bookmarkEnd w:id="49"/>
-    <w:bookmarkEnd w:id="50"/>
-    <w:bookmarkStart w:id="51" w:name="mathematical-notation"/>
+    <w:bookmarkEnd w:id="47"/>
+    <w:bookmarkEnd w:id="48"/>
+    <w:bookmarkStart w:id="49" w:name="mathematical-notation"/>
     <w:p>
       <w:pPr>
         <w:pStyle w:val="Heading2"/>
       </w:pPr>
       <w:r>
-        <w:t xml:space="preserve">7 Mathematical Notation</w:t>
+        <w:t xml:space="preserve">6 Mathematical Notation</w:t>
       </w:r>
     </w:p>
     <w:p>
@@ -5231,14 +5149,14 @@
         </m:oMath>
       </m:oMathPara>
     </w:p>
-    <w:bookmarkEnd w:id="51"/>
-    <w:bookmarkStart w:id="55" w:name="tips-and-best-practices"/>
+    <w:bookmarkEnd w:id="49"/>
+    <w:bookmarkStart w:id="53" w:name="tips-and-best-practices"/>
     <w:p>
       <w:pPr>
         <w:pStyle w:val="Heading2"/>
       </w:pPr>
       <w:r>
-        <w:t xml:space="preserve">8 Tips and Best Practices</w:t>
+        <w:t xml:space="preserve">7 Tips and Best Practices</w:t>
       </w:r>
     </w:p>
     <w:tbl>
@@ -5282,18 +5200,18 @@
                 <wp:inline>
                   <wp:extent cx="152400" cy="152400"/>
                   <wp:effectExtent b="0" l="0" r="0" t="0"/>
-                  <wp:docPr descr="" title="" id="53" name="Picture"/>
+                  <wp:docPr descr="" title="" id="51" name="Picture"/>
                   <a:graphic>
                     <a:graphicData uri="http://schemas.openxmlformats.org/drawingml/2006/picture">
                       <pic:pic>
                         <pic:nvPicPr>
-                          <pic:cNvPr descr="/opt/quarto/share/formats/docx/tip.png" id="54" name="Picture"/>
+                          <pic:cNvPr descr="/opt/quarto/share/formats/docx/tip.png" id="52" name="Picture"/>
                           <pic:cNvPicPr>
                             <a:picLocks noChangeArrowheads="1" noChangeAspect="1"/>
                           </pic:cNvPicPr>
                         </pic:nvPicPr>
                         <pic:blipFill>
-                          <a:blip r:embed="rId52"/>
+                          <a:blip r:embed="rId50"/>
                           <a:stretch>
                             <a:fillRect/>
                           </a:stretch>
@@ -5417,14 +5335,14 @@
         </w:tc>
       </w:tr>
     </w:tbl>
-    <w:bookmarkEnd w:id="55"/>
-    <w:bookmarkStart w:id="56" w:name="conclusion"/>
+    <w:bookmarkEnd w:id="53"/>
+    <w:bookmarkStart w:id="54" w:name="conclusion"/>
     <w:p>
       <w:pPr>
         <w:pStyle w:val="Heading2"/>
       </w:pPr>
       <w:r>
-        <w:t xml:space="preserve">9 Conclusion</w:t>
+        <w:t xml:space="preserve">8 Conclusion</w:t>
       </w:r>
     </w:p>
     <w:p>
@@ -5435,14 +5353,14 @@
         <w:t xml:space="preserve">This article demonstrates the advanced capabilities of Quarto for creating rich, interactive documentation for R packages.</w:t>
       </w:r>
     </w:p>
-    <w:bookmarkEnd w:id="56"/>
-    <w:bookmarkStart w:id="60" w:name="learn-more"/>
+    <w:bookmarkEnd w:id="54"/>
+    <w:bookmarkStart w:id="58" w:name="learn-more"/>
     <w:p>
       <w:pPr>
         <w:pStyle w:val="Heading2"/>
       </w:pPr>
       <w:r>
-        <w:t xml:space="preserve">10 Learn More</w:t>
+        <w:t xml:space="preserve">9 Learn More</w:t>
       </w:r>
     </w:p>
     <w:p>
@@ -5459,7 +5377,7 @@
       <w:r>
         <w:t xml:space="preserve"> </w:t>
       </w:r>
-      <w:hyperlink r:id="rId57">
+      <w:hyperlink r:id="rId55">
         <w:r>
           <w:rPr>
             <w:rStyle w:val="Hyperlink"/>
@@ -5482,7 +5400,7 @@
       <w:r>
         <w:t xml:space="preserve"> </w:t>
       </w:r>
-      <w:hyperlink r:id="rId58">
+      <w:hyperlink r:id="rId56">
         <w:r>
           <w:rPr>
             <w:rStyle w:val="Hyperlink"/>
@@ -5505,7 +5423,7 @@
       <w:r>
         <w:t xml:space="preserve"> </w:t>
       </w:r>
-      <w:hyperlink r:id="rId59">
+      <w:hyperlink r:id="rId57">
         <w:r>
           <w:rPr>
             <w:rStyle w:val="Hyperlink"/>
@@ -5514,19 +5432,19 @@
         </w:r>
       </w:hyperlink>
     </w:p>
+    <w:bookmarkEnd w:id="58"/>
+    <w:bookmarkStart w:id="60" w:name="references"/>
+    <w:p>
+      <w:pPr>
+        <w:pStyle w:val="Heading2"/>
+      </w:pPr>
+      <w:r>
+        <w:t xml:space="preserve">10 References</w:t>
+      </w:r>
+    </w:p>
+    <w:bookmarkStart w:id="59" w:name="refs"/>
+    <w:bookmarkEnd w:id="59"/>
     <w:bookmarkEnd w:id="60"/>
-    <w:bookmarkStart w:id="62" w:name="references"/>
-    <w:p>
-      <w:pPr>
-        <w:pStyle w:val="Heading2"/>
-      </w:pPr>
-      <w:r>
-        <w:t xml:space="preserve">11 References</w:t>
-      </w:r>
-    </w:p>
-    <w:bookmarkStart w:id="61" w:name="refs"/>
-    <w:bookmarkEnd w:id="61"/>
-    <w:bookmarkEnd w:id="62"/>
     <w:sectPr>
       <w:footnotePr>
         <w:numRestart w:val="eachSect"/>

</xml_diff>